<commit_message>
Justified alignment of the text in the Template Report.docx file and added a new utility function in utils.py to support text justification.
</commit_message>
<xml_diff>
--- a/Templates/Template Report.docx
+++ b/Templates/Template Report.docx
@@ -86,6 +86,7 @@
             <w:dataBinding w:prefixMappings="xmlns:ns0='http://purl.org/dc/elements/1.1/' xmlns:ns1='http://schemas.openxmlformats.org/package/2006/metadata/core-properties' " w:xpath="/ns1:coreProperties[1]/ns0:title[1]" w:storeItemID="{6C3C8BC8-F283-45AE-878A-BAB7291924A1}"/>
             <w:text/>
           </w:sdtPr>
+          <w:sdtEndPr/>
           <w:sdtContent>
             <w:tc>
               <w:tcPr>
@@ -166,6 +167,7 @@
             <w:dataBinding w:prefixMappings="xmlns:ns0='http://purl.org/dc/elements/1.1/' xmlns:ns1='http://schemas.openxmlformats.org/package/2006/metadata/core-properties' " w:xpath="/ns1:coreProperties[1]/ns0:subject[1]" w:storeItemID="{6C3C8BC8-F283-45AE-878A-BAB7291924A1}"/>
             <w:text/>
           </w:sdtPr>
+          <w:sdtEndPr/>
           <w:sdtContent>
             <w:tc>
               <w:tcPr>
@@ -336,6 +338,7 @@
               <w:dataBinding w:prefixMappings="xmlns:ns0='http://purl.org/dc/elements/1.1/' xmlns:ns1='http://schemas.openxmlformats.org/package/2006/metadata/core-properties' " w:xpath="/ns1:coreProperties[1]/ns0:creator[1]" w:storeItemID="{6C3C8BC8-F283-45AE-878A-BAB7291924A1}"/>
               <w:text/>
             </w:sdtPr>
+            <w:sdtEndPr/>
             <w:sdtContent>
               <w:p>
                 <w:pPr>
@@ -869,6 +872,7 @@
             <w:dataBinding w:prefixMappings="xmlns:ns0='http://purl.org/dc/elements/1.1/' xmlns:ns1='http://schemas.openxmlformats.org/package/2006/metadata/core-properties' " w:xpath="/ns1:coreProperties[1]/ns1:keywords[1]" w:storeItemID="{6C3C8BC8-F283-45AE-878A-BAB7291924A1}"/>
             <w:text/>
           </w:sdtPr>
+          <w:sdtEndPr/>
           <w:sdtContent>
             <w:tc>
               <w:tcPr>
@@ -1520,6 +1524,7 @@
         </w:numPr>
         <w:spacing w:before="80"/>
         <w:ind w:left="720"/>
+        <w:jc w:val="both"/>
         <w:rPr>
           <w:rFonts w:asciiTheme="minorHAnsi" w:hAnsiTheme="minorHAnsi"/>
           <w:szCs w:val="24"/>
@@ -1649,6 +1654,7 @@
         <w:dataBinding w:prefixMappings="xmlns:ns0='http://purl.org/dc/elements/1.1/' xmlns:ns1='http://schemas.openxmlformats.org/package/2006/metadata/core-properties' " w:xpath="/ns1:coreProperties[1]/ns0:creator[1]" w:storeItemID="{6C3C8BC8-F283-45AE-878A-BAB7291924A1}"/>
         <w:text/>
       </w:sdtPr>
+      <w:sdtEndPr/>
       <w:sdtContent>
         <w:p>
           <w:pPr>
@@ -2337,6 +2343,11 @@
         <w:dataBinding w:prefixMappings="xmlns:ns0='http://purl.org/dc/elements/1.1/' xmlns:ns1='http://schemas.openxmlformats.org/package/2006/metadata/core-properties' " w:xpath="/ns1:coreProperties[1]/ns0:title[1]" w:storeItemID="{6C3C8BC8-F283-45AE-878A-BAB7291924A1}"/>
         <w:text/>
       </w:sdtPr>
+      <w:sdtEndPr>
+        <w:rPr>
+          <w:rStyle w:val="PageNumber"/>
+        </w:rPr>
+      </w:sdtEndPr>
       <w:sdtContent>
         <w:r>
           <w:rPr>
@@ -2466,6 +2477,7 @@
         <w:dataBinding w:prefixMappings="xmlns:ns0='http://purl.org/dc/elements/1.1/' xmlns:ns1='http://schemas.openxmlformats.org/package/2006/metadata/core-properties' " w:xpath="/ns1:coreProperties[1]/ns0:subject[1]" w:storeItemID="{6C3C8BC8-F283-45AE-878A-BAB7291924A1}"/>
         <w:text/>
       </w:sdtPr>
+      <w:sdtEndPr/>
       <w:sdtContent>
         <w:r>
           <w:rPr>
@@ -2517,6 +2529,7 @@
         <w:dataBinding w:prefixMappings="xmlns:ns0='http://purl.org/dc/elements/1.1/' xmlns:ns1='http://schemas.openxmlformats.org/package/2006/metadata/core-properties' " w:xpath="/ns1:coreProperties[1]/ns1:keywords[1]" w:storeItemID="{6C3C8BC8-F283-45AE-878A-BAB7291924A1}"/>
         <w:text/>
       </w:sdtPr>
+      <w:sdtEndPr/>
       <w:sdtContent>
         <w:r>
           <w:rPr>
@@ -7489,6 +7502,7 @@
     <w:rsid w:val="00260419"/>
     <w:rsid w:val="002871E2"/>
     <w:rsid w:val="002C30A2"/>
+    <w:rsid w:val="0030531C"/>
     <w:rsid w:val="003178A5"/>
     <w:rsid w:val="00373B66"/>
     <w:rsid w:val="003E423E"/>
@@ -7526,6 +7540,7 @@
     <w:rsid w:val="00AE5D55"/>
     <w:rsid w:val="00C55073"/>
     <w:rsid w:val="00C973AB"/>
+    <w:rsid w:val="00D03F24"/>
     <w:rsid w:val="00D56DC5"/>
     <w:rsid w:val="00D62349"/>
     <w:rsid w:val="00D65164"/>

</xml_diff>